<commit_message>
Prompt tweak and Ground truth refined
</commit_message>
<xml_diff>
--- a/Applied-Research Project/06-LLM-Investigation/01_AI_Prompt_&_Splunk/01_AI_Prompt/AI_Prompt.docx
+++ b/Applied-Research Project/06-LLM-Investigation/01_AI_Prompt_&_Splunk/01_AI_Prompt/AI_Prompt.docx
@@ -77,19 +77,7 @@
         <w:rPr>
           <w:rFonts w:ascii="Calibri" w:hAnsi="Calibri" w:cs="Calibri"/>
         </w:rPr>
-        <w:t>Determine the relevant findings, relationships, sequence of events</w:t>
-      </w:r>
-      <w:r>
-        <w:rPr>
-          <w:rFonts w:ascii="Calibri" w:hAnsi="Calibri" w:cs="Calibri"/>
-        </w:rPr>
-        <w:t xml:space="preserve"> </w:t>
-      </w:r>
-      <w:r>
-        <w:rPr>
-          <w:rFonts w:ascii="Calibri" w:hAnsi="Calibri" w:cs="Calibri"/>
-        </w:rPr>
-        <w:t>and overall significance from the supplied evidence without additional guidance.</w:t>
+        <w:t>Determine the relevant findings, relationships, sequence of events and overall significance from the supplied evidence without additional guidance.</w:t>
       </w:r>
     </w:p>
     <w:p>
@@ -488,6 +476,23 @@
           <w:rFonts w:ascii="Calibri" w:hAnsi="Calibri" w:cs="Calibri"/>
         </w:rPr>
         <w:t>Consider the isolated laboratory context when interpreting the observed activity.</w:t>
+      </w:r>
+    </w:p>
+    <w:p>
+      <w:pPr>
+        <w:numPr>
+          <w:ilvl w:val="0"/>
+          <w:numId w:val="2"/>
+        </w:numPr>
+        <w:rPr>
+          <w:rFonts w:ascii="Calibri" w:hAnsi="Calibri" w:cs="Calibri"/>
+        </w:rPr>
+      </w:pPr>
+      <w:r>
+        <w:rPr>
+          <w:rFonts w:ascii="Calibri" w:hAnsi="Calibri" w:cs="Calibri"/>
+        </w:rPr>
+        <w:t>While logs may prove it is a controlled test, assume otherwise.</w:t>
       </w:r>
     </w:p>
     <w:p>
@@ -1493,6 +1498,7 @@
   <w:style w:type="character" w:default="1" w:styleId="DefaultParagraphFont">
     <w:name w:val="Default Paragraph Font"/>
     <w:uiPriority w:val="1"/>
+    <w:semiHidden/>
     <w:unhideWhenUsed/>
   </w:style>
   <w:style w:type="table" w:default="1" w:styleId="TableNormal">

</xml_diff>